<commit_message>
Add .doc version of the Class 2 Hindi book
Start each chapter with an explicit page break so chapters still begin
on a new page when the book is saved in the older Word 97-2003 format.

Co-Authored-By: Claude Opus 5.5 <noreply@anthropic.com>
Claude-Session: https://claude.ai/code/session_01PCuZzSpWtQUSSFNd8qrg8F
</commit_message>
<xml_diff>
--- a/book/Kilkari_Hindi_Class2.docx
+++ b/book/Kilkari_Hindi_Class2.docx
@@ -1001,6 +1001,19 @@
         </w:sectPr>
       </w:pPr>
     </w:p>
+    <w:p>
+      <w:pPr>
+        <w:pageBreakBefore/>
+        <w:spacing w:after="0" w:before="0" w:line="240"/>
+      </w:pPr>
+      <w:r>
+        <w:rPr>
+          <w:sz w:val="2"/>
+          <w:szCs w:val="2"/>
+        </w:rPr>
+        <w:t xml:space="preserve"/>
+      </w:r>
+    </w:p>
     <w:tbl>
       <w:tblPr>
         <w:tblW w:type="dxa" w:w="9906"/>
@@ -2426,6 +2439,7 @@
         </w:tc>
       </w:tr>
     </w:tbl>
+    <w:p/>
     <w:p>
       <w:pPr>
         <w:sectPr>
@@ -2443,6 +2457,19 @@
           <w:docGrid w:linePitch="360"/>
         </w:sectPr>
       </w:pPr>
+    </w:p>
+    <w:p>
+      <w:pPr>
+        <w:pageBreakBefore/>
+        <w:spacing w:after="0" w:before="0" w:line="240"/>
+      </w:pPr>
+      <w:r>
+        <w:rPr>
+          <w:sz w:val="2"/>
+          <w:szCs w:val="2"/>
+        </w:rPr>
+        <w:t xml:space="preserve"/>
+      </w:r>
     </w:p>
     <w:tbl>
       <w:tblPr>
@@ -4236,6 +4263,7 @@
         </w:tc>
       </w:tr>
     </w:tbl>
+    <w:p/>
     <w:p>
       <w:pPr>
         <w:sectPr>
@@ -4253,6 +4281,19 @@
           <w:docGrid w:linePitch="360"/>
         </w:sectPr>
       </w:pPr>
+    </w:p>
+    <w:p>
+      <w:pPr>
+        <w:pageBreakBefore/>
+        <w:spacing w:after="0" w:before="0" w:line="240"/>
+      </w:pPr>
+      <w:r>
+        <w:rPr>
+          <w:sz w:val="2"/>
+          <w:szCs w:val="2"/>
+        </w:rPr>
+        <w:t xml:space="preserve"/>
+      </w:r>
     </w:p>
     <w:tbl>
       <w:tblPr>
@@ -5649,6 +5690,7 @@
         </w:tc>
       </w:tr>
     </w:tbl>
+    <w:p/>
     <w:p>
       <w:pPr>
         <w:sectPr>
@@ -5666,6 +5708,19 @@
           <w:docGrid w:linePitch="360"/>
         </w:sectPr>
       </w:pPr>
+    </w:p>
+    <w:p>
+      <w:pPr>
+        <w:pageBreakBefore/>
+        <w:spacing w:after="0" w:before="0" w:line="240"/>
+      </w:pPr>
+      <w:r>
+        <w:rPr>
+          <w:sz w:val="2"/>
+          <w:szCs w:val="2"/>
+        </w:rPr>
+        <w:t xml:space="preserve"/>
+      </w:r>
     </w:p>
     <w:tbl>
       <w:tblPr>
@@ -7062,6 +7117,7 @@
         </w:tc>
       </w:tr>
     </w:tbl>
+    <w:p/>
     <w:p>
       <w:pPr>
         <w:sectPr>
@@ -7079,6 +7135,19 @@
           <w:docGrid w:linePitch="360"/>
         </w:sectPr>
       </w:pPr>
+    </w:p>
+    <w:p>
+      <w:pPr>
+        <w:pageBreakBefore/>
+        <w:spacing w:after="0" w:before="0" w:line="240"/>
+      </w:pPr>
+      <w:r>
+        <w:rPr>
+          <w:sz w:val="2"/>
+          <w:szCs w:val="2"/>
+        </w:rPr>
+        <w:t xml:space="preserve"/>
+      </w:r>
     </w:p>
     <w:tbl>
       <w:tblPr>
@@ -8872,6 +8941,7 @@
         </w:tc>
       </w:tr>
     </w:tbl>
+    <w:p/>
     <w:p>
       <w:pPr>
         <w:sectPr>
@@ -8889,6 +8959,19 @@
           <w:docGrid w:linePitch="360"/>
         </w:sectPr>
       </w:pPr>
+    </w:p>
+    <w:p>
+      <w:pPr>
+        <w:pageBreakBefore/>
+        <w:spacing w:after="0" w:before="0" w:line="240"/>
+      </w:pPr>
+      <w:r>
+        <w:rPr>
+          <w:sz w:val="2"/>
+          <w:szCs w:val="2"/>
+        </w:rPr>
+        <w:t xml:space="preserve"/>
+      </w:r>
     </w:p>
     <w:tbl>
       <w:tblPr>
@@ -10270,6 +10353,7 @@
         </w:tc>
       </w:tr>
     </w:tbl>
+    <w:p/>
     <w:p>
       <w:pPr>
         <w:sectPr>
@@ -10287,6 +10371,19 @@
           <w:docGrid w:linePitch="360"/>
         </w:sectPr>
       </w:pPr>
+    </w:p>
+    <w:p>
+      <w:pPr>
+        <w:pageBreakBefore/>
+        <w:spacing w:after="0" w:before="0" w:line="240"/>
+      </w:pPr>
+      <w:r>
+        <w:rPr>
+          <w:sz w:val="2"/>
+          <w:szCs w:val="2"/>
+        </w:rPr>
+        <w:t xml:space="preserve"/>
+      </w:r>
     </w:p>
     <w:tbl>
       <w:tblPr>
@@ -11683,6 +11780,7 @@
         </w:tc>
       </w:tr>
     </w:tbl>
+    <w:p/>
     <w:sectPr>
       <w:headerReference w:type="default" r:id="rId19"/>
       <w:footerReference w:type="default" r:id="rId20"/>

</xml_diff>